<commit_message>
feat(thue-cpc): định dạng mẫu đơn máy theo file chuẩn (không đụng mẫu đa máy)
- Cách letterhead 1 dòng trước tiêu đề; cách tiêu đề 1 dòng trước info.
- Tên KH: UPPER + đậm. Địa chỉ / Vị trí / Ngày chốt / Người liên hệ / Email /
  Thời hạn: chữ thường. Mã máy, Loại máy: đậm.
- Dòng Đen A4 / Màu A4: cao 1cm (567 twips).
- Ngày + Số BC đầu/cuối kỳ (đen/màu): in đậm.
- "Hà Nội, ngày..." canh giữa trên ĐẠI DIỆN CÔNG TY (đưa vào cột phải khối chữ ký).
- twoColSign tham số hóa -> mẫu đa máy giữ nguyên.

Co-Authored-By: Claude Opus 4.8 <noreply@anthropic.com>
</commit_message>
<xml_diff>
--- a/src/lib/report/bang-ke-don-may.docx
+++ b/src/lib/report/bang-ke-don-may.docx
@@ -50,7 +50,20 @@
     </w:p>
     <w:p>
       <w:pPr>
-        <w:spacing w:after="120" w:before="60"/>
+        <w:spacing w:after="0" w:before="0"/>
+      </w:pPr>
+      <w:r>
+        <w:rPr>
+          <w:rFonts w:ascii="Times New Roman" w:cs="Times New Roman" w:eastAsia="Times New Roman" w:hAnsi="Times New Roman"/>
+          <w:sz w:val="24"/>
+          <w:szCs w:val="24"/>
+        </w:rPr>
+        <w:t xml:space="preserve"/>
+      </w:r>
+    </w:p>
+    <w:p>
+      <w:pPr>
+        <w:spacing w:after="0" w:before="0"/>
         <w:jc w:val="center"/>
       </w:pPr>
       <w:r>
@@ -66,6 +79,19 @@
     </w:p>
     <w:p>
       <w:pPr>
+        <w:spacing w:after="0" w:before="0"/>
+      </w:pPr>
+      <w:r>
+        <w:rPr>
+          <w:rFonts w:ascii="Times New Roman" w:cs="Times New Roman" w:eastAsia="Times New Roman" w:hAnsi="Times New Roman"/>
+          <w:sz w:val="24"/>
+          <w:szCs w:val="24"/>
+        </w:rPr>
+        <w:t xml:space="preserve"/>
+      </w:r>
+    </w:p>
+    <w:p>
+      <w:pPr>
         <w:spacing w:after="20" w:before="20" w:line="360" w:lineRule="auto"/>
       </w:pPr>
       <w:r>
@@ -142,8 +168,8 @@
       <w:r>
         <w:rPr>
           <w:rFonts w:ascii="Times New Roman" w:cs="Times New Roman" w:eastAsia="Times New Roman" w:hAnsi="Times New Roman"/>
-          <w:b/>
-          <w:bCs/>
+          <w:b w:val="false"/>
+          <w:bCs w:val="false"/>
           <w:sz w:val="24"/>
           <w:szCs w:val="24"/>
         </w:rPr>
@@ -185,8 +211,8 @@
       <w:r>
         <w:rPr>
           <w:rFonts w:ascii="Times New Roman" w:cs="Times New Roman" w:eastAsia="Times New Roman" w:hAnsi="Times New Roman"/>
-          <w:b/>
-          <w:bCs/>
+          <w:b w:val="false"/>
+          <w:bCs w:val="false"/>
           <w:sz w:val="24"/>
           <w:szCs w:val="24"/>
         </w:rPr>
@@ -257,8 +283,8 @@
             <w:r>
               <w:rPr>
                 <w:rFonts w:ascii="Times New Roman" w:cs="Times New Roman" w:eastAsia="Times New Roman" w:hAnsi="Times New Roman"/>
-                <w:b/>
-                <w:bCs/>
+                <w:b w:val="false"/>
+                <w:bCs w:val="false"/>
                 <w:sz w:val="24"/>
                 <w:szCs w:val="24"/>
               </w:rPr>
@@ -391,8 +417,8 @@
             <w:r>
               <w:rPr>
                 <w:rFonts w:ascii="Times New Roman" w:cs="Times New Roman" w:eastAsia="Times New Roman" w:hAnsi="Times New Roman"/>
-                <w:b/>
-                <w:bCs/>
+                <w:b w:val="false"/>
+                <w:bCs w:val="false"/>
                 <w:sz w:val="24"/>
                 <w:szCs w:val="24"/>
               </w:rPr>
@@ -523,8 +549,8 @@
             <w:r>
               <w:rPr>
                 <w:rFonts w:ascii="Times New Roman" w:cs="Times New Roman" w:eastAsia="Times New Roman" w:hAnsi="Times New Roman"/>
-                <w:b/>
-                <w:bCs/>
+                <w:b w:val="false"/>
+                <w:bCs w:val="false"/>
                 <w:sz w:val="24"/>
                 <w:szCs w:val="24"/>
               </w:rPr>
@@ -580,8 +606,8 @@
             <w:r>
               <w:rPr>
                 <w:rFonts w:ascii="Times New Roman" w:cs="Times New Roman" w:eastAsia="Times New Roman" w:hAnsi="Times New Roman"/>
-                <w:b/>
-                <w:bCs/>
+                <w:b w:val="false"/>
+                <w:bCs w:val="false"/>
                 <w:sz w:val="24"/>
                 <w:szCs w:val="24"/>
               </w:rPr>
@@ -1927,6 +1953,9 @@
         </w:tc>
       </w:tr>
       <w:tr>
+        <w:trPr>
+          <w:trHeight w:val="567" w:hRule="atLeast"/>
+        </w:trPr>
         <w:tc>
           <w:tcPr>
             <w:tcMar>
@@ -1973,296 +2002,307 @@
             <w:r>
               <w:rPr>
                 <w:rFonts w:ascii="Times New Roman" w:cs="Times New Roman" w:eastAsia="Times New Roman" w:hAnsi="Times New Roman"/>
-                <w:sz w:val="24"/>
-                <w:szCs w:val="24"/>
-              </w:rPr>
-              <w:t xml:space="preserve">{{NGAY_DAU}}</w:t>
-            </w:r>
-          </w:p>
-        </w:tc>
-        <w:tc>
-          <w:tcPr>
-            <w:tcMar>
-              <w:top w:type="dxa" w:w="20"/>
-              <w:left w:type="dxa" w:w="40"/>
-              <w:bottom w:type="dxa" w:w="20"/>
-              <w:right w:type="dxa" w:w="40"/>
-            </w:tcMar>
-            <w:vAlign w:val="center"/>
-          </w:tcPr>
-          <w:p>
-            <w:pPr>
-              <w:spacing w:after="0" w:before="0"/>
-              <w:jc w:val="center"/>
-            </w:pPr>
-            <w:r>
-              <w:rPr>
-                <w:rFonts w:ascii="Times New Roman" w:cs="Times New Roman" w:eastAsia="Times New Roman" w:hAnsi="Times New Roman"/>
-                <w:sz w:val="24"/>
-                <w:szCs w:val="24"/>
-              </w:rPr>
-              <w:t xml:space="preserve">{{DEN_SO_DAU}}</w:t>
-            </w:r>
-          </w:p>
-        </w:tc>
-        <w:tc>
-          <w:tcPr>
-            <w:vMerge w:val="restart"/>
-            <w:tcMar>
-              <w:top w:type="dxa" w:w="20"/>
-              <w:left w:type="dxa" w:w="40"/>
-              <w:bottom w:type="dxa" w:w="20"/>
-              <w:right w:type="dxa" w:w="40"/>
-            </w:tcMar>
-            <w:vAlign w:val="center"/>
-          </w:tcPr>
-          <w:p>
-            <w:pPr>
-              <w:spacing w:after="0" w:before="0"/>
-              <w:jc w:val="center"/>
-            </w:pPr>
-            <w:r>
-              <w:rPr>
-                <w:rFonts w:ascii="Times New Roman" w:cs="Times New Roman" w:eastAsia="Times New Roman" w:hAnsi="Times New Roman"/>
-                <w:sz w:val="24"/>
-                <w:szCs w:val="24"/>
-              </w:rPr>
-              <w:t xml:space="preserve">{{NGAY_CUOI}}</w:t>
-            </w:r>
-          </w:p>
-        </w:tc>
-        <w:tc>
-          <w:tcPr>
-            <w:tcMar>
-              <w:top w:type="dxa" w:w="20"/>
-              <w:left w:type="dxa" w:w="40"/>
-              <w:bottom w:type="dxa" w:w="20"/>
-              <w:right w:type="dxa" w:w="40"/>
-            </w:tcMar>
-            <w:vAlign w:val="center"/>
-          </w:tcPr>
-          <w:p>
-            <w:pPr>
-              <w:spacing w:after="0" w:before="0"/>
-              <w:jc w:val="center"/>
-            </w:pPr>
-            <w:r>
-              <w:rPr>
-                <w:rFonts w:ascii="Times New Roman" w:cs="Times New Roman" w:eastAsia="Times New Roman" w:hAnsi="Times New Roman"/>
-                <w:sz w:val="24"/>
-                <w:szCs w:val="24"/>
-              </w:rPr>
-              <w:t xml:space="preserve">{{DEN_SO_CUOI}}</w:t>
-            </w:r>
-          </w:p>
-        </w:tc>
-        <w:tc>
-          <w:tcPr>
-            <w:tcMar>
-              <w:top w:type="dxa" w:w="20"/>
-              <w:left w:type="dxa" w:w="40"/>
-              <w:bottom w:type="dxa" w:w="20"/>
-              <w:right w:type="dxa" w:w="40"/>
-            </w:tcMar>
-            <w:vAlign w:val="center"/>
-          </w:tcPr>
-          <w:p>
-            <w:pPr>
-              <w:spacing w:after="0" w:before="0"/>
-              <w:jc w:val="center"/>
-            </w:pPr>
-            <w:r>
-              <w:rPr>
-                <w:rFonts w:ascii="Times New Roman" w:cs="Times New Roman" w:eastAsia="Times New Roman" w:hAnsi="Times New Roman"/>
-                <w:sz w:val="24"/>
-                <w:szCs w:val="24"/>
-              </w:rPr>
-              <w:t xml:space="preserve">{{DEN_SD}}</w:t>
-            </w:r>
-          </w:p>
-        </w:tc>
-        <w:tc>
-          <w:tcPr>
-            <w:tcMar>
-              <w:top w:type="dxa" w:w="20"/>
-              <w:left w:type="dxa" w:w="40"/>
-              <w:bottom w:type="dxa" w:w="20"/>
-              <w:right w:type="dxa" w:w="40"/>
-            </w:tcMar>
-            <w:vAlign w:val="center"/>
-          </w:tcPr>
-          <w:p>
-            <w:pPr>
-              <w:spacing w:after="0" w:before="0"/>
-              <w:jc w:val="center"/>
-            </w:pPr>
-            <w:r>
-              <w:rPr>
-                <w:rFonts w:ascii="Times New Roman" w:cs="Times New Roman" w:eastAsia="Times New Roman" w:hAnsi="Times New Roman"/>
-                <w:sz w:val="24"/>
-                <w:szCs w:val="24"/>
-              </w:rPr>
-              <w:t xml:space="preserve">{{DEN_MF}}</w:t>
-            </w:r>
-          </w:p>
-        </w:tc>
-        <w:tc>
-          <w:tcPr>
-            <w:tcMar>
-              <w:top w:type="dxa" w:w="20"/>
-              <w:left w:type="dxa" w:w="40"/>
-              <w:bottom w:type="dxa" w:w="20"/>
-              <w:right w:type="dxa" w:w="40"/>
-            </w:tcMar>
-            <w:vAlign w:val="center"/>
-          </w:tcPr>
-          <w:p>
-            <w:pPr>
-              <w:spacing w:after="0" w:before="0"/>
-              <w:jc w:val="center"/>
-            </w:pPr>
-            <w:r>
-              <w:rPr>
-                <w:rFonts w:ascii="Times New Roman" w:cs="Times New Roman" w:eastAsia="Times New Roman" w:hAnsi="Times New Roman"/>
-                <w:sz w:val="24"/>
-                <w:szCs w:val="24"/>
-              </w:rPr>
-              <w:t xml:space="preserve">{{DEN_TP}}</w:t>
-            </w:r>
-          </w:p>
-        </w:tc>
-        <w:tc>
-          <w:tcPr>
-            <w:tcMar>
-              <w:top w:type="dxa" w:w="20"/>
-              <w:left w:type="dxa" w:w="40"/>
-              <w:bottom w:type="dxa" w:w="20"/>
-              <w:right w:type="dxa" w:w="40"/>
-            </w:tcMar>
-            <w:vAlign w:val="center"/>
-          </w:tcPr>
-          <w:p>
-            <w:pPr>
-              <w:spacing w:after="0" w:before="0"/>
-              <w:jc w:val="center"/>
-            </w:pPr>
-            <w:r>
-              <w:rPr>
-                <w:rFonts w:ascii="Times New Roman" w:cs="Times New Roman" w:eastAsia="Times New Roman" w:hAnsi="Times New Roman"/>
-                <w:sz w:val="24"/>
-                <w:szCs w:val="24"/>
-              </w:rPr>
-              <w:t xml:space="preserve">{{DEN_DG}}</w:t>
-            </w:r>
-          </w:p>
-        </w:tc>
-        <w:tc>
-          <w:tcPr>
-            <w:tcMar>
-              <w:top w:type="dxa" w:w="20"/>
-              <w:left w:type="dxa" w:w="40"/>
-              <w:bottom w:type="dxa" w:w="20"/>
-              <w:right w:type="dxa" w:w="40"/>
-            </w:tcMar>
-            <w:vAlign w:val="center"/>
-          </w:tcPr>
-          <w:p>
-            <w:pPr>
-              <w:spacing w:after="0" w:before="0"/>
-              <w:jc w:val="center"/>
-            </w:pPr>
-            <w:r>
-              <w:rPr>
-                <w:rFonts w:ascii="Times New Roman" w:cs="Times New Roman" w:eastAsia="Times New Roman" w:hAnsi="Times New Roman"/>
-                <w:sz w:val="24"/>
-                <w:szCs w:val="24"/>
-              </w:rPr>
-              <w:t xml:space="preserve">{{DEN_TT}}</w:t>
-            </w:r>
-          </w:p>
-        </w:tc>
-        <w:tc>
-          <w:tcPr>
-            <w:vMerge w:val="restart"/>
-            <w:tcMar>
-              <w:top w:type="dxa" w:w="20"/>
-              <w:left w:type="dxa" w:w="40"/>
-              <w:bottom w:type="dxa" w:w="20"/>
-              <w:right w:type="dxa" w:w="40"/>
-            </w:tcMar>
-            <w:vAlign w:val="center"/>
-          </w:tcPr>
-          <w:p>
-            <w:pPr>
-              <w:spacing w:after="0" w:before="0"/>
-              <w:jc w:val="center"/>
-            </w:pPr>
-            <w:r>
-              <w:rPr>
-                <w:rFonts w:ascii="Times New Roman" w:cs="Times New Roman" w:eastAsia="Times New Roman" w:hAnsi="Times New Roman"/>
-                <w:sz w:val="24"/>
-                <w:szCs w:val="24"/>
-              </w:rPr>
-              <w:t xml:space="preserve">{{PHI_TOI_THIEU_THANG}}</w:t>
-            </w:r>
-          </w:p>
-        </w:tc>
-        <w:tc>
-          <w:tcPr>
-            <w:vMerge w:val="restart"/>
-            <w:tcMar>
-              <w:top w:type="dxa" w:w="20"/>
-              <w:left w:type="dxa" w:w="40"/>
-              <w:bottom w:type="dxa" w:w="20"/>
-              <w:right w:type="dxa" w:w="40"/>
-            </w:tcMar>
-            <w:vAlign w:val="center"/>
-          </w:tcPr>
-          <w:p>
-            <w:pPr>
-              <w:spacing w:after="0" w:before="0"/>
-              <w:jc w:val="center"/>
-            </w:pPr>
-            <w:r>
-              <w:rPr>
-                <w:rFonts w:ascii="Times New Roman" w:cs="Times New Roman" w:eastAsia="Times New Roman" w:hAnsi="Times New Roman"/>
-                <w:sz w:val="24"/>
-                <w:szCs w:val="24"/>
-              </w:rPr>
-              <w:t xml:space="preserve">{{TONG_TRUOC_VAT}}</w:t>
-            </w:r>
-          </w:p>
-        </w:tc>
-        <w:tc>
-          <w:tcPr>
-            <w:vMerge w:val="restart"/>
-            <w:tcMar>
-              <w:top w:type="dxa" w:w="20"/>
-              <w:left w:type="dxa" w:w="40"/>
-              <w:bottom w:type="dxa" w:w="20"/>
-              <w:right w:type="dxa" w:w="40"/>
-            </w:tcMar>
-            <w:vAlign w:val="center"/>
-          </w:tcPr>
-          <w:p>
-            <w:pPr>
-              <w:spacing w:after="0" w:before="0"/>
-              <w:jc w:val="center"/>
-            </w:pPr>
-            <w:r>
-              <w:rPr>
-                <w:rFonts w:ascii="Times New Roman" w:cs="Times New Roman" w:eastAsia="Times New Roman" w:hAnsi="Times New Roman"/>
                 <w:b/>
                 <w:bCs/>
                 <w:sz w:val="24"/>
                 <w:szCs w:val="24"/>
               </w:rPr>
+              <w:t xml:space="preserve">{{NGAY_DAU}}</w:t>
+            </w:r>
+          </w:p>
+        </w:tc>
+        <w:tc>
+          <w:tcPr>
+            <w:tcMar>
+              <w:top w:type="dxa" w:w="20"/>
+              <w:left w:type="dxa" w:w="40"/>
+              <w:bottom w:type="dxa" w:w="20"/>
+              <w:right w:type="dxa" w:w="40"/>
+            </w:tcMar>
+            <w:vAlign w:val="center"/>
+          </w:tcPr>
+          <w:p>
+            <w:pPr>
+              <w:spacing w:after="0" w:before="0"/>
+              <w:jc w:val="center"/>
+            </w:pPr>
+            <w:r>
+              <w:rPr>
+                <w:rFonts w:ascii="Times New Roman" w:cs="Times New Roman" w:eastAsia="Times New Roman" w:hAnsi="Times New Roman"/>
+                <w:b/>
+                <w:bCs/>
+                <w:sz w:val="24"/>
+                <w:szCs w:val="24"/>
+              </w:rPr>
+              <w:t xml:space="preserve">{{DEN_SO_DAU}}</w:t>
+            </w:r>
+          </w:p>
+        </w:tc>
+        <w:tc>
+          <w:tcPr>
+            <w:vMerge w:val="restart"/>
+            <w:tcMar>
+              <w:top w:type="dxa" w:w="20"/>
+              <w:left w:type="dxa" w:w="40"/>
+              <w:bottom w:type="dxa" w:w="20"/>
+              <w:right w:type="dxa" w:w="40"/>
+            </w:tcMar>
+            <w:vAlign w:val="center"/>
+          </w:tcPr>
+          <w:p>
+            <w:pPr>
+              <w:spacing w:after="0" w:before="0"/>
+              <w:jc w:val="center"/>
+            </w:pPr>
+            <w:r>
+              <w:rPr>
+                <w:rFonts w:ascii="Times New Roman" w:cs="Times New Roman" w:eastAsia="Times New Roman" w:hAnsi="Times New Roman"/>
+                <w:b/>
+                <w:bCs/>
+                <w:sz w:val="24"/>
+                <w:szCs w:val="24"/>
+              </w:rPr>
+              <w:t xml:space="preserve">{{NGAY_CUOI}}</w:t>
+            </w:r>
+          </w:p>
+        </w:tc>
+        <w:tc>
+          <w:tcPr>
+            <w:tcMar>
+              <w:top w:type="dxa" w:w="20"/>
+              <w:left w:type="dxa" w:w="40"/>
+              <w:bottom w:type="dxa" w:w="20"/>
+              <w:right w:type="dxa" w:w="40"/>
+            </w:tcMar>
+            <w:vAlign w:val="center"/>
+          </w:tcPr>
+          <w:p>
+            <w:pPr>
+              <w:spacing w:after="0" w:before="0"/>
+              <w:jc w:val="center"/>
+            </w:pPr>
+            <w:r>
+              <w:rPr>
+                <w:rFonts w:ascii="Times New Roman" w:cs="Times New Roman" w:eastAsia="Times New Roman" w:hAnsi="Times New Roman"/>
+                <w:b/>
+                <w:bCs/>
+                <w:sz w:val="24"/>
+                <w:szCs w:val="24"/>
+              </w:rPr>
+              <w:t xml:space="preserve">{{DEN_SO_CUOI}}</w:t>
+            </w:r>
+          </w:p>
+        </w:tc>
+        <w:tc>
+          <w:tcPr>
+            <w:tcMar>
+              <w:top w:type="dxa" w:w="20"/>
+              <w:left w:type="dxa" w:w="40"/>
+              <w:bottom w:type="dxa" w:w="20"/>
+              <w:right w:type="dxa" w:w="40"/>
+            </w:tcMar>
+            <w:vAlign w:val="center"/>
+          </w:tcPr>
+          <w:p>
+            <w:pPr>
+              <w:spacing w:after="0" w:before="0"/>
+              <w:jc w:val="center"/>
+            </w:pPr>
+            <w:r>
+              <w:rPr>
+                <w:rFonts w:ascii="Times New Roman" w:cs="Times New Roman" w:eastAsia="Times New Roman" w:hAnsi="Times New Roman"/>
+                <w:sz w:val="24"/>
+                <w:szCs w:val="24"/>
+              </w:rPr>
+              <w:t xml:space="preserve">{{DEN_SD}}</w:t>
+            </w:r>
+          </w:p>
+        </w:tc>
+        <w:tc>
+          <w:tcPr>
+            <w:tcMar>
+              <w:top w:type="dxa" w:w="20"/>
+              <w:left w:type="dxa" w:w="40"/>
+              <w:bottom w:type="dxa" w:w="20"/>
+              <w:right w:type="dxa" w:w="40"/>
+            </w:tcMar>
+            <w:vAlign w:val="center"/>
+          </w:tcPr>
+          <w:p>
+            <w:pPr>
+              <w:spacing w:after="0" w:before="0"/>
+              <w:jc w:val="center"/>
+            </w:pPr>
+            <w:r>
+              <w:rPr>
+                <w:rFonts w:ascii="Times New Roman" w:cs="Times New Roman" w:eastAsia="Times New Roman" w:hAnsi="Times New Roman"/>
+                <w:sz w:val="24"/>
+                <w:szCs w:val="24"/>
+              </w:rPr>
+              <w:t xml:space="preserve">{{DEN_MF}}</w:t>
+            </w:r>
+          </w:p>
+        </w:tc>
+        <w:tc>
+          <w:tcPr>
+            <w:tcMar>
+              <w:top w:type="dxa" w:w="20"/>
+              <w:left w:type="dxa" w:w="40"/>
+              <w:bottom w:type="dxa" w:w="20"/>
+              <w:right w:type="dxa" w:w="40"/>
+            </w:tcMar>
+            <w:vAlign w:val="center"/>
+          </w:tcPr>
+          <w:p>
+            <w:pPr>
+              <w:spacing w:after="0" w:before="0"/>
+              <w:jc w:val="center"/>
+            </w:pPr>
+            <w:r>
+              <w:rPr>
+                <w:rFonts w:ascii="Times New Roman" w:cs="Times New Roman" w:eastAsia="Times New Roman" w:hAnsi="Times New Roman"/>
+                <w:sz w:val="24"/>
+                <w:szCs w:val="24"/>
+              </w:rPr>
+              <w:t xml:space="preserve">{{DEN_TP}}</w:t>
+            </w:r>
+          </w:p>
+        </w:tc>
+        <w:tc>
+          <w:tcPr>
+            <w:tcMar>
+              <w:top w:type="dxa" w:w="20"/>
+              <w:left w:type="dxa" w:w="40"/>
+              <w:bottom w:type="dxa" w:w="20"/>
+              <w:right w:type="dxa" w:w="40"/>
+            </w:tcMar>
+            <w:vAlign w:val="center"/>
+          </w:tcPr>
+          <w:p>
+            <w:pPr>
+              <w:spacing w:after="0" w:before="0"/>
+              <w:jc w:val="center"/>
+            </w:pPr>
+            <w:r>
+              <w:rPr>
+                <w:rFonts w:ascii="Times New Roman" w:cs="Times New Roman" w:eastAsia="Times New Roman" w:hAnsi="Times New Roman"/>
+                <w:sz w:val="24"/>
+                <w:szCs w:val="24"/>
+              </w:rPr>
+              <w:t xml:space="preserve">{{DEN_DG}}</w:t>
+            </w:r>
+          </w:p>
+        </w:tc>
+        <w:tc>
+          <w:tcPr>
+            <w:tcMar>
+              <w:top w:type="dxa" w:w="20"/>
+              <w:left w:type="dxa" w:w="40"/>
+              <w:bottom w:type="dxa" w:w="20"/>
+              <w:right w:type="dxa" w:w="40"/>
+            </w:tcMar>
+            <w:vAlign w:val="center"/>
+          </w:tcPr>
+          <w:p>
+            <w:pPr>
+              <w:spacing w:after="0" w:before="0"/>
+              <w:jc w:val="center"/>
+            </w:pPr>
+            <w:r>
+              <w:rPr>
+                <w:rFonts w:ascii="Times New Roman" w:cs="Times New Roman" w:eastAsia="Times New Roman" w:hAnsi="Times New Roman"/>
+                <w:sz w:val="24"/>
+                <w:szCs w:val="24"/>
+              </w:rPr>
+              <w:t xml:space="preserve">{{DEN_TT}}</w:t>
+            </w:r>
+          </w:p>
+        </w:tc>
+        <w:tc>
+          <w:tcPr>
+            <w:vMerge w:val="restart"/>
+            <w:tcMar>
+              <w:top w:type="dxa" w:w="20"/>
+              <w:left w:type="dxa" w:w="40"/>
+              <w:bottom w:type="dxa" w:w="20"/>
+              <w:right w:type="dxa" w:w="40"/>
+            </w:tcMar>
+            <w:vAlign w:val="center"/>
+          </w:tcPr>
+          <w:p>
+            <w:pPr>
+              <w:spacing w:after="0" w:before="0"/>
+              <w:jc w:val="center"/>
+            </w:pPr>
+            <w:r>
+              <w:rPr>
+                <w:rFonts w:ascii="Times New Roman" w:cs="Times New Roman" w:eastAsia="Times New Roman" w:hAnsi="Times New Roman"/>
+                <w:sz w:val="24"/>
+                <w:szCs w:val="24"/>
+              </w:rPr>
+              <w:t xml:space="preserve">{{PHI_TOI_THIEU_THANG}}</w:t>
+            </w:r>
+          </w:p>
+        </w:tc>
+        <w:tc>
+          <w:tcPr>
+            <w:vMerge w:val="restart"/>
+            <w:tcMar>
+              <w:top w:type="dxa" w:w="20"/>
+              <w:left w:type="dxa" w:w="40"/>
+              <w:bottom w:type="dxa" w:w="20"/>
+              <w:right w:type="dxa" w:w="40"/>
+            </w:tcMar>
+            <w:vAlign w:val="center"/>
+          </w:tcPr>
+          <w:p>
+            <w:pPr>
+              <w:spacing w:after="0" w:before="0"/>
+              <w:jc w:val="center"/>
+            </w:pPr>
+            <w:r>
+              <w:rPr>
+                <w:rFonts w:ascii="Times New Roman" w:cs="Times New Roman" w:eastAsia="Times New Roman" w:hAnsi="Times New Roman"/>
+                <w:sz w:val="24"/>
+                <w:szCs w:val="24"/>
+              </w:rPr>
+              <w:t xml:space="preserve">{{TONG_TRUOC_VAT}}</w:t>
+            </w:r>
+          </w:p>
+        </w:tc>
+        <w:tc>
+          <w:tcPr>
+            <w:vMerge w:val="restart"/>
+            <w:tcMar>
+              <w:top w:type="dxa" w:w="20"/>
+              <w:left w:type="dxa" w:w="40"/>
+              <w:bottom w:type="dxa" w:w="20"/>
+              <w:right w:type="dxa" w:w="40"/>
+            </w:tcMar>
+            <w:vAlign w:val="center"/>
+          </w:tcPr>
+          <w:p>
+            <w:pPr>
+              <w:spacing w:after="0" w:before="0"/>
+              <w:jc w:val="center"/>
+            </w:pPr>
+            <w:r>
+              <w:rPr>
+                <w:rFonts w:ascii="Times New Roman" w:cs="Times New Roman" w:eastAsia="Times New Roman" w:hAnsi="Times New Roman"/>
+                <w:b/>
+                <w:bCs/>
+                <w:sz w:val="24"/>
+                <w:szCs w:val="24"/>
+              </w:rPr>
               <w:t xml:space="preserve">{{TONG_SAU_VAT}}</w:t>
             </w:r>
           </w:p>
         </w:tc>
       </w:tr>
       <w:tr>
+        <w:trPr>
+          <w:trHeight w:val="567" w:hRule="atLeast"/>
+        </w:trPr>
         <w:tc>
           <w:tcPr>
             <w:tcMar>
@@ -2333,6 +2373,8 @@
             <w:r>
               <w:rPr>
                 <w:rFonts w:ascii="Times New Roman" w:cs="Times New Roman" w:eastAsia="Times New Roman" w:hAnsi="Times New Roman"/>
+                <w:b/>
+                <w:bCs/>
                 <w:sz w:val="24"/>
                 <w:szCs w:val="24"/>
               </w:rPr>
@@ -2383,6 +2425,8 @@
             <w:r>
               <w:rPr>
                 <w:rFonts w:ascii="Times New Roman" w:cs="Times New Roman" w:eastAsia="Times New Roman" w:hAnsi="Times New Roman"/>
+                <w:b/>
+                <w:bCs/>
                 <w:sz w:val="24"/>
                 <w:szCs w:val="24"/>
               </w:rPr>
@@ -2648,18 +2692,15 @@
     </w:p>
     <w:p>
       <w:pPr>
-        <w:spacing w:before="160"/>
-        <w:jc w:val="right"/>
+        <w:spacing w:after="0" w:before="0"/>
       </w:pPr>
       <w:r>
         <w:rPr>
           <w:rFonts w:ascii="Times New Roman" w:cs="Times New Roman" w:eastAsia="Times New Roman" w:hAnsi="Times New Roman"/>
-          <w:i/>
-          <w:iCs/>
           <w:sz w:val="24"/>
           <w:szCs w:val="24"/>
         </w:rPr>
-        <w:t xml:space="preserve">{{NGAY_LAP_BANG_KE}}</w:t>
+        <w:t xml:space="preserve"/>
       </w:r>
     </w:p>
     <w:tbl>
@@ -2691,7 +2732,21 @@
           </w:tcPr>
           <w:p>
             <w:pPr>
-              <w:spacing w:before="80"/>
+              <w:spacing w:after="0" w:before="0"/>
+              <w:jc w:val="center"/>
+            </w:pPr>
+            <w:r>
+              <w:rPr>
+                <w:rFonts w:ascii="Times New Roman" w:cs="Times New Roman" w:eastAsia="Times New Roman" w:hAnsi="Times New Roman"/>
+                <w:sz w:val="24"/>
+                <w:szCs w:val="24"/>
+              </w:rPr>
+              <w:t xml:space="preserve"/>
+            </w:r>
+          </w:p>
+          <w:p>
+            <w:pPr>
+              <w:spacing w:after="0" w:before="0"/>
               <w:jc w:val="center"/>
             </w:pPr>
             <w:r>
@@ -2717,7 +2772,23 @@
           </w:tcPr>
           <w:p>
             <w:pPr>
-              <w:spacing w:before="80"/>
+              <w:spacing w:after="0" w:before="0"/>
+              <w:jc w:val="center"/>
+            </w:pPr>
+            <w:r>
+              <w:rPr>
+                <w:rFonts w:ascii="Times New Roman" w:cs="Times New Roman" w:eastAsia="Times New Roman" w:hAnsi="Times New Roman"/>
+                <w:b/>
+                <w:bCs/>
+                <w:sz w:val="24"/>
+                <w:szCs w:val="24"/>
+              </w:rPr>
+              <w:t xml:space="preserve">{{NGAY_LAP_BANG_KE}}</w:t>
+            </w:r>
+          </w:p>
+          <w:p>
+            <w:pPr>
+              <w:spacing w:after="0" w:before="0"/>
               <w:jc w:val="center"/>
             </w:pPr>
             <w:r>

</xml_diff>

<commit_message>
chore(thue-cpc): dòng "Hà Nội, ngày..." mẫu đơn máy -> nghiêng, không đậm
Co-Authored-By: Claude Opus 4.8 <noreply@anthropic.com>
</commit_message>
<xml_diff>
--- a/src/lib/report/bang-ke-don-may.docx
+++ b/src/lib/report/bang-ke-don-may.docx
@@ -2778,8 +2778,8 @@
             <w:r>
               <w:rPr>
                 <w:rFonts w:ascii="Times New Roman" w:cs="Times New Roman" w:eastAsia="Times New Roman" w:hAnsi="Times New Roman"/>
-                <w:b/>
-                <w:bCs/>
+                <w:i/>
+                <w:iCs/>
                 <w:sz w:val="24"/>
                 <w:szCs w:val="24"/>
               </w:rPr>

</xml_diff>